<commit_message>
Se completan los puntos 3 a 5 del TP2 y se actualiza prompts.md
</commit_message>
<xml_diff>
--- a/docs/entregas/TP2-Summate.docx
+++ b/docs/entregas/TP2-Summate.docx
@@ -186,6 +186,7 @@
         </w:rPr>
         <w:t xml:space="preserve">Equipo: </w:t>
       </w:r>
+      <w:proofErr w:type="spellStart"/>
       <w:r>
         <w:rPr>
           <w:rFonts w:cs="Arial"/>
@@ -196,6 +197,7 @@
         </w:rPr>
         <w:t>Summate</w:t>
       </w:r>
+      <w:proofErr w:type="spellEnd"/>
     </w:p>
     <w:p>
       <w:pPr>
@@ -413,12 +415,14 @@
                 <w:lang w:val="es-AR"/>
               </w:rPr>
             </w:pPr>
+            <w:proofErr w:type="spellStart"/>
             <w:r>
               <w:rPr>
                 <w:lang w:val="es-AR"/>
               </w:rPr>
               <w:t>Agasi</w:t>
             </w:r>
+            <w:proofErr w:type="spellEnd"/>
           </w:p>
         </w:tc>
         <w:tc>
@@ -843,12 +847,14 @@
                 <w:lang w:val="es-AR"/>
               </w:rPr>
             </w:pPr>
+            <w:proofErr w:type="spellStart"/>
             <w:r>
               <w:rPr>
                 <w:lang w:val="es-AR"/>
               </w:rPr>
               <w:t>Panigazzi</w:t>
             </w:r>
+            <w:proofErr w:type="spellEnd"/>
           </w:p>
         </w:tc>
         <w:tc>
@@ -986,12 +992,14 @@
                 <w:lang w:val="es-AR"/>
               </w:rPr>
             </w:pPr>
+            <w:proofErr w:type="spellStart"/>
             <w:r>
               <w:rPr>
                 <w:lang w:val="es-AR"/>
               </w:rPr>
               <w:t>Rios</w:t>
             </w:r>
+            <w:proofErr w:type="spellEnd"/>
           </w:p>
         </w:tc>
         <w:tc>
@@ -1236,7 +1244,7 @@
           <w:r>
             <w:fldChar w:fldCharType="separate"/>
           </w:r>
-          <w:hyperlink w:anchor="_Toc238779060" w:history="1">
+          <w:hyperlink w:anchor="_Toc239006138" w:history="1">
             <w:r>
               <w:rPr>
                 <w:rStyle w:val="Hipervnculo"/>
@@ -1264,7 +1272,7 @@
                 <w:noProof/>
                 <w:webHidden/>
               </w:rPr>
-              <w:instrText xml:space="preserve"> PAGEREF _Toc238779060 \h </w:instrText>
+              <w:instrText xml:space="preserve"> PAGEREF _Toc239006138 \h </w:instrText>
             </w:r>
             <w:r>
               <w:rPr>
@@ -1309,7 +1317,7 @@
               <w14:ligatures w14:val="standardContextual"/>
             </w:rPr>
           </w:pPr>
-          <w:hyperlink w:anchor="_Toc238779061" w:history="1">
+          <w:hyperlink w:anchor="_Toc239006139" w:history="1">
             <w:r>
               <w:rPr>
                 <w:rStyle w:val="Hipervnculo"/>
@@ -1337,7 +1345,7 @@
                 <w:noProof/>
                 <w:webHidden/>
               </w:rPr>
-              <w:instrText xml:space="preserve"> PAGEREF _Toc238779061 \h </w:instrText>
+              <w:instrText xml:space="preserve"> PAGEREF _Toc239006139 \h </w:instrText>
             </w:r>
             <w:r>
               <w:rPr>
@@ -1382,11 +1390,12 @@
               <w14:ligatures w14:val="standardContextual"/>
             </w:rPr>
           </w:pPr>
-          <w:hyperlink w:anchor="_Toc238779062" w:history="1">
+          <w:hyperlink w:anchor="_Toc239006140" w:history="1">
             <w:r>
               <w:rPr>
                 <w:rStyle w:val="Hipervnculo"/>
                 <w:noProof/>
+                <w:lang w:val="es-AR"/>
               </w:rPr>
               <w:t>Justificación de la elección</w:t>
             </w:r>
@@ -1409,7 +1418,7 @@
                 <w:noProof/>
                 <w:webHidden/>
               </w:rPr>
-              <w:instrText xml:space="preserve"> PAGEREF _Toc238779062 \h </w:instrText>
+              <w:instrText xml:space="preserve"> PAGEREF _Toc239006140 \h </w:instrText>
             </w:r>
             <w:r>
               <w:rPr>
@@ -1430,6 +1439,739 @@
                 <w:webHidden/>
               </w:rPr>
               <w:t>3</w:t>
+            </w:r>
+            <w:r>
+              <w:rPr>
+                <w:noProof/>
+                <w:webHidden/>
+              </w:rPr>
+              <w:fldChar w:fldCharType="end"/>
+            </w:r>
+          </w:hyperlink>
+        </w:p>
+        <w:p>
+          <w:pPr>
+            <w:pStyle w:val="TDC1"/>
+            <w:rPr>
+              <w:rFonts w:asciiTheme="minorHAnsi" w:hAnsiTheme="minorHAnsi"/>
+              <w:b w:val="0"/>
+              <w:noProof/>
+              <w:color w:val="auto"/>
+              <w:kern w:val="2"/>
+              <w:sz w:val="24"/>
+              <w:szCs w:val="24"/>
+              <w:lang w:val="es-AR" w:eastAsia="es-AR"/>
+              <w14:ligatures w14:val="standardContextual"/>
+            </w:rPr>
+          </w:pPr>
+          <w:hyperlink w:anchor="_Toc239006141" w:history="1">
+            <w:r>
+              <w:rPr>
+                <w:rStyle w:val="Hipervnculo"/>
+                <w:noProof/>
+                <w:lang w:val="es-AR"/>
+              </w:rPr>
+              <w:t>Analizar los resultados</w:t>
+            </w:r>
+            <w:r>
+              <w:rPr>
+                <w:noProof/>
+                <w:webHidden/>
+              </w:rPr>
+              <w:tab/>
+            </w:r>
+            <w:r>
+              <w:rPr>
+                <w:noProof/>
+                <w:webHidden/>
+              </w:rPr>
+              <w:fldChar w:fldCharType="begin"/>
+            </w:r>
+            <w:r>
+              <w:rPr>
+                <w:noProof/>
+                <w:webHidden/>
+              </w:rPr>
+              <w:instrText xml:space="preserve"> PAGEREF _Toc239006141 \h </w:instrText>
+            </w:r>
+            <w:r>
+              <w:rPr>
+                <w:noProof/>
+                <w:webHidden/>
+              </w:rPr>
+            </w:r>
+            <w:r>
+              <w:rPr>
+                <w:noProof/>
+                <w:webHidden/>
+              </w:rPr>
+              <w:fldChar w:fldCharType="separate"/>
+            </w:r>
+            <w:r>
+              <w:rPr>
+                <w:noProof/>
+                <w:webHidden/>
+              </w:rPr>
+              <w:t>3</w:t>
+            </w:r>
+            <w:r>
+              <w:rPr>
+                <w:noProof/>
+                <w:webHidden/>
+              </w:rPr>
+              <w:fldChar w:fldCharType="end"/>
+            </w:r>
+          </w:hyperlink>
+        </w:p>
+        <w:p>
+          <w:pPr>
+            <w:pStyle w:val="TDC2"/>
+            <w:rPr>
+              <w:rFonts w:asciiTheme="minorHAnsi" w:hAnsiTheme="minorHAnsi"/>
+              <w:noProof/>
+              <w:color w:val="auto"/>
+              <w:kern w:val="2"/>
+              <w:sz w:val="24"/>
+              <w:szCs w:val="24"/>
+              <w:lang w:val="es-AR" w:eastAsia="es-AR"/>
+              <w14:ligatures w14:val="standardContextual"/>
+            </w:rPr>
+          </w:pPr>
+          <w:hyperlink w:anchor="_Toc239006142" w:history="1">
+            <w:r>
+              <w:rPr>
+                <w:rStyle w:val="Hipervnculo"/>
+                <w:noProof/>
+                <w:lang w:val="es-AR"/>
+              </w:rPr>
+              <w:t>Perfil del usuario</w:t>
+            </w:r>
+            <w:r>
+              <w:rPr>
+                <w:noProof/>
+                <w:webHidden/>
+              </w:rPr>
+              <w:tab/>
+            </w:r>
+            <w:r>
+              <w:rPr>
+                <w:noProof/>
+                <w:webHidden/>
+              </w:rPr>
+              <w:fldChar w:fldCharType="begin"/>
+            </w:r>
+            <w:r>
+              <w:rPr>
+                <w:noProof/>
+                <w:webHidden/>
+              </w:rPr>
+              <w:instrText xml:space="preserve"> PAGEREF _Toc239006142 \h </w:instrText>
+            </w:r>
+            <w:r>
+              <w:rPr>
+                <w:noProof/>
+                <w:webHidden/>
+              </w:rPr>
+            </w:r>
+            <w:r>
+              <w:rPr>
+                <w:noProof/>
+                <w:webHidden/>
+              </w:rPr>
+              <w:fldChar w:fldCharType="separate"/>
+            </w:r>
+            <w:r>
+              <w:rPr>
+                <w:noProof/>
+                <w:webHidden/>
+              </w:rPr>
+              <w:t>3</w:t>
+            </w:r>
+            <w:r>
+              <w:rPr>
+                <w:noProof/>
+                <w:webHidden/>
+              </w:rPr>
+              <w:fldChar w:fldCharType="end"/>
+            </w:r>
+          </w:hyperlink>
+        </w:p>
+        <w:p>
+          <w:pPr>
+            <w:pStyle w:val="TDC2"/>
+            <w:rPr>
+              <w:rFonts w:asciiTheme="minorHAnsi" w:hAnsiTheme="minorHAnsi"/>
+              <w:noProof/>
+              <w:color w:val="auto"/>
+              <w:kern w:val="2"/>
+              <w:sz w:val="24"/>
+              <w:szCs w:val="24"/>
+              <w:lang w:val="es-AR" w:eastAsia="es-AR"/>
+              <w14:ligatures w14:val="standardContextual"/>
+            </w:rPr>
+          </w:pPr>
+          <w:hyperlink w:anchor="_Toc239006143" w:history="1">
+            <w:r>
+              <w:rPr>
+                <w:rStyle w:val="Hipervnculo"/>
+                <w:noProof/>
+                <w:lang w:val="es-AR"/>
+              </w:rPr>
+              <w:t>Necesidades reales</w:t>
+            </w:r>
+            <w:r>
+              <w:rPr>
+                <w:noProof/>
+                <w:webHidden/>
+              </w:rPr>
+              <w:tab/>
+            </w:r>
+            <w:r>
+              <w:rPr>
+                <w:noProof/>
+                <w:webHidden/>
+              </w:rPr>
+              <w:fldChar w:fldCharType="begin"/>
+            </w:r>
+            <w:r>
+              <w:rPr>
+                <w:noProof/>
+                <w:webHidden/>
+              </w:rPr>
+              <w:instrText xml:space="preserve"> PAGEREF _Toc239006143 \h </w:instrText>
+            </w:r>
+            <w:r>
+              <w:rPr>
+                <w:noProof/>
+                <w:webHidden/>
+              </w:rPr>
+            </w:r>
+            <w:r>
+              <w:rPr>
+                <w:noProof/>
+                <w:webHidden/>
+              </w:rPr>
+              <w:fldChar w:fldCharType="separate"/>
+            </w:r>
+            <w:r>
+              <w:rPr>
+                <w:noProof/>
+                <w:webHidden/>
+              </w:rPr>
+              <w:t>3</w:t>
+            </w:r>
+            <w:r>
+              <w:rPr>
+                <w:noProof/>
+                <w:webHidden/>
+              </w:rPr>
+              <w:fldChar w:fldCharType="end"/>
+            </w:r>
+          </w:hyperlink>
+        </w:p>
+        <w:p>
+          <w:pPr>
+            <w:pStyle w:val="TDC2"/>
+            <w:rPr>
+              <w:rFonts w:asciiTheme="minorHAnsi" w:hAnsiTheme="minorHAnsi"/>
+              <w:noProof/>
+              <w:color w:val="auto"/>
+              <w:kern w:val="2"/>
+              <w:sz w:val="24"/>
+              <w:szCs w:val="24"/>
+              <w:lang w:val="es-AR" w:eastAsia="es-AR"/>
+              <w14:ligatures w14:val="standardContextual"/>
+            </w:rPr>
+          </w:pPr>
+          <w:hyperlink w:anchor="_Toc239006144" w:history="1">
+            <w:r>
+              <w:rPr>
+                <w:rStyle w:val="Hipervnculo"/>
+                <w:noProof/>
+                <w:lang w:val="es-AR"/>
+              </w:rPr>
+              <w:t>Problemas y frustraciones concretas</w:t>
+            </w:r>
+            <w:r>
+              <w:rPr>
+                <w:noProof/>
+                <w:webHidden/>
+              </w:rPr>
+              <w:tab/>
+            </w:r>
+            <w:r>
+              <w:rPr>
+                <w:noProof/>
+                <w:webHidden/>
+              </w:rPr>
+              <w:fldChar w:fldCharType="begin"/>
+            </w:r>
+            <w:r>
+              <w:rPr>
+                <w:noProof/>
+                <w:webHidden/>
+              </w:rPr>
+              <w:instrText xml:space="preserve"> PAGEREF _Toc239006144 \h </w:instrText>
+            </w:r>
+            <w:r>
+              <w:rPr>
+                <w:noProof/>
+                <w:webHidden/>
+              </w:rPr>
+            </w:r>
+            <w:r>
+              <w:rPr>
+                <w:noProof/>
+                <w:webHidden/>
+              </w:rPr>
+              <w:fldChar w:fldCharType="separate"/>
+            </w:r>
+            <w:r>
+              <w:rPr>
+                <w:noProof/>
+                <w:webHidden/>
+              </w:rPr>
+              <w:t>3</w:t>
+            </w:r>
+            <w:r>
+              <w:rPr>
+                <w:noProof/>
+                <w:webHidden/>
+              </w:rPr>
+              <w:fldChar w:fldCharType="end"/>
+            </w:r>
+          </w:hyperlink>
+        </w:p>
+        <w:p>
+          <w:pPr>
+            <w:pStyle w:val="TDC2"/>
+            <w:rPr>
+              <w:rFonts w:asciiTheme="minorHAnsi" w:hAnsiTheme="minorHAnsi"/>
+              <w:noProof/>
+              <w:color w:val="auto"/>
+              <w:kern w:val="2"/>
+              <w:sz w:val="24"/>
+              <w:szCs w:val="24"/>
+              <w:lang w:val="es-AR" w:eastAsia="es-AR"/>
+              <w14:ligatures w14:val="standardContextual"/>
+            </w:rPr>
+          </w:pPr>
+          <w:hyperlink w:anchor="_Toc239006145" w:history="1">
+            <w:r>
+              <w:rPr>
+                <w:rStyle w:val="Hipervnculo"/>
+                <w:noProof/>
+                <w:lang w:val="es-AR"/>
+              </w:rPr>
+              <w:t>Contexto de uso</w:t>
+            </w:r>
+            <w:r>
+              <w:rPr>
+                <w:noProof/>
+                <w:webHidden/>
+              </w:rPr>
+              <w:tab/>
+            </w:r>
+            <w:r>
+              <w:rPr>
+                <w:noProof/>
+                <w:webHidden/>
+              </w:rPr>
+              <w:fldChar w:fldCharType="begin"/>
+            </w:r>
+            <w:r>
+              <w:rPr>
+                <w:noProof/>
+                <w:webHidden/>
+              </w:rPr>
+              <w:instrText xml:space="preserve"> PAGEREF _Toc239006145 \h </w:instrText>
+            </w:r>
+            <w:r>
+              <w:rPr>
+                <w:noProof/>
+                <w:webHidden/>
+              </w:rPr>
+            </w:r>
+            <w:r>
+              <w:rPr>
+                <w:noProof/>
+                <w:webHidden/>
+              </w:rPr>
+              <w:fldChar w:fldCharType="separate"/>
+            </w:r>
+            <w:r>
+              <w:rPr>
+                <w:noProof/>
+                <w:webHidden/>
+              </w:rPr>
+              <w:t>4</w:t>
+            </w:r>
+            <w:r>
+              <w:rPr>
+                <w:noProof/>
+                <w:webHidden/>
+              </w:rPr>
+              <w:fldChar w:fldCharType="end"/>
+            </w:r>
+          </w:hyperlink>
+        </w:p>
+        <w:p>
+          <w:pPr>
+            <w:pStyle w:val="TDC1"/>
+            <w:rPr>
+              <w:rFonts w:asciiTheme="minorHAnsi" w:hAnsiTheme="minorHAnsi"/>
+              <w:b w:val="0"/>
+              <w:noProof/>
+              <w:color w:val="auto"/>
+              <w:kern w:val="2"/>
+              <w:sz w:val="24"/>
+              <w:szCs w:val="24"/>
+              <w:lang w:val="es-AR" w:eastAsia="es-AR"/>
+              <w14:ligatures w14:val="standardContextual"/>
+            </w:rPr>
+          </w:pPr>
+          <w:hyperlink w:anchor="_Toc239006146" w:history="1">
+            <w:r>
+              <w:rPr>
+                <w:rStyle w:val="Hipervnculo"/>
+                <w:noProof/>
+                <w:lang w:val="es-AR"/>
+              </w:rPr>
+              <w:t>Confrontar los supuestos del TP1</w:t>
+            </w:r>
+            <w:r>
+              <w:rPr>
+                <w:noProof/>
+                <w:webHidden/>
+              </w:rPr>
+              <w:tab/>
+            </w:r>
+            <w:r>
+              <w:rPr>
+                <w:noProof/>
+                <w:webHidden/>
+              </w:rPr>
+              <w:fldChar w:fldCharType="begin"/>
+            </w:r>
+            <w:r>
+              <w:rPr>
+                <w:noProof/>
+                <w:webHidden/>
+              </w:rPr>
+              <w:instrText xml:space="preserve"> PAGEREF _Toc239006146 \h </w:instrText>
+            </w:r>
+            <w:r>
+              <w:rPr>
+                <w:noProof/>
+                <w:webHidden/>
+              </w:rPr>
+            </w:r>
+            <w:r>
+              <w:rPr>
+                <w:noProof/>
+                <w:webHidden/>
+              </w:rPr>
+              <w:fldChar w:fldCharType="separate"/>
+            </w:r>
+            <w:r>
+              <w:rPr>
+                <w:noProof/>
+                <w:webHidden/>
+              </w:rPr>
+              <w:t>4</w:t>
+            </w:r>
+            <w:r>
+              <w:rPr>
+                <w:noProof/>
+                <w:webHidden/>
+              </w:rPr>
+              <w:fldChar w:fldCharType="end"/>
+            </w:r>
+          </w:hyperlink>
+        </w:p>
+        <w:p>
+          <w:pPr>
+            <w:pStyle w:val="TDC2"/>
+            <w:rPr>
+              <w:rFonts w:asciiTheme="minorHAnsi" w:hAnsiTheme="minorHAnsi"/>
+              <w:noProof/>
+              <w:color w:val="auto"/>
+              <w:kern w:val="2"/>
+              <w:sz w:val="24"/>
+              <w:szCs w:val="24"/>
+              <w:lang w:val="es-AR" w:eastAsia="es-AR"/>
+              <w14:ligatures w14:val="standardContextual"/>
+            </w:rPr>
+          </w:pPr>
+          <w:hyperlink w:anchor="_Toc239006147" w:history="1">
+            <w:r>
+              <w:rPr>
+                <w:rStyle w:val="Hipervnculo"/>
+                <w:noProof/>
+                <w:lang w:val="es-AR"/>
+              </w:rPr>
+              <w:t>Hallazgos no previstos</w:t>
+            </w:r>
+            <w:r>
+              <w:rPr>
+                <w:noProof/>
+                <w:webHidden/>
+              </w:rPr>
+              <w:tab/>
+            </w:r>
+            <w:r>
+              <w:rPr>
+                <w:noProof/>
+                <w:webHidden/>
+              </w:rPr>
+              <w:fldChar w:fldCharType="begin"/>
+            </w:r>
+            <w:r>
+              <w:rPr>
+                <w:noProof/>
+                <w:webHidden/>
+              </w:rPr>
+              <w:instrText xml:space="preserve"> PAGEREF _Toc239006147 \h </w:instrText>
+            </w:r>
+            <w:r>
+              <w:rPr>
+                <w:noProof/>
+                <w:webHidden/>
+              </w:rPr>
+            </w:r>
+            <w:r>
+              <w:rPr>
+                <w:noProof/>
+                <w:webHidden/>
+              </w:rPr>
+              <w:fldChar w:fldCharType="separate"/>
+            </w:r>
+            <w:r>
+              <w:rPr>
+                <w:noProof/>
+                <w:webHidden/>
+              </w:rPr>
+              <w:t>4</w:t>
+            </w:r>
+            <w:r>
+              <w:rPr>
+                <w:noProof/>
+                <w:webHidden/>
+              </w:rPr>
+              <w:fldChar w:fldCharType="end"/>
+            </w:r>
+          </w:hyperlink>
+        </w:p>
+        <w:p>
+          <w:pPr>
+            <w:pStyle w:val="TDC2"/>
+            <w:rPr>
+              <w:rFonts w:asciiTheme="minorHAnsi" w:hAnsiTheme="minorHAnsi"/>
+              <w:noProof/>
+              <w:color w:val="auto"/>
+              <w:kern w:val="2"/>
+              <w:sz w:val="24"/>
+              <w:szCs w:val="24"/>
+              <w:lang w:val="es-AR" w:eastAsia="es-AR"/>
+              <w14:ligatures w14:val="standardContextual"/>
+            </w:rPr>
+          </w:pPr>
+          <w:hyperlink w:anchor="_Toc239006148" w:history="1">
+            <w:r>
+              <w:rPr>
+                <w:rStyle w:val="Hipervnculo"/>
+                <w:noProof/>
+                <w:lang w:val="es-AR"/>
+              </w:rPr>
+              <w:t>Supuesto crítico</w:t>
+            </w:r>
+            <w:r>
+              <w:rPr>
+                <w:noProof/>
+                <w:webHidden/>
+              </w:rPr>
+              <w:tab/>
+            </w:r>
+            <w:r>
+              <w:rPr>
+                <w:noProof/>
+                <w:webHidden/>
+              </w:rPr>
+              <w:fldChar w:fldCharType="begin"/>
+            </w:r>
+            <w:r>
+              <w:rPr>
+                <w:noProof/>
+                <w:webHidden/>
+              </w:rPr>
+              <w:instrText xml:space="preserve"> PAGEREF _Toc239006148 \h </w:instrText>
+            </w:r>
+            <w:r>
+              <w:rPr>
+                <w:noProof/>
+                <w:webHidden/>
+              </w:rPr>
+            </w:r>
+            <w:r>
+              <w:rPr>
+                <w:noProof/>
+                <w:webHidden/>
+              </w:rPr>
+              <w:fldChar w:fldCharType="separate"/>
+            </w:r>
+            <w:r>
+              <w:rPr>
+                <w:noProof/>
+                <w:webHidden/>
+              </w:rPr>
+              <w:t>5</w:t>
+            </w:r>
+            <w:r>
+              <w:rPr>
+                <w:noProof/>
+                <w:webHidden/>
+              </w:rPr>
+              <w:fldChar w:fldCharType="end"/>
+            </w:r>
+          </w:hyperlink>
+        </w:p>
+        <w:p>
+          <w:pPr>
+            <w:pStyle w:val="TDC2"/>
+            <w:rPr>
+              <w:rFonts w:asciiTheme="minorHAnsi" w:hAnsiTheme="minorHAnsi"/>
+              <w:noProof/>
+              <w:color w:val="auto"/>
+              <w:kern w:val="2"/>
+              <w:sz w:val="24"/>
+              <w:szCs w:val="24"/>
+              <w:lang w:val="es-AR" w:eastAsia="es-AR"/>
+              <w14:ligatures w14:val="standardContextual"/>
+            </w:rPr>
+          </w:pPr>
+          <w:hyperlink w:anchor="_Toc239006149" w:history="1">
+            <w:r>
+              <w:rPr>
+                <w:rStyle w:val="Hipervnculo"/>
+                <w:noProof/>
+                <w:lang w:val="es-AR"/>
+              </w:rPr>
+              <w:t>Usuario primario</w:t>
+            </w:r>
+            <w:r>
+              <w:rPr>
+                <w:noProof/>
+                <w:webHidden/>
+              </w:rPr>
+              <w:tab/>
+            </w:r>
+            <w:r>
+              <w:rPr>
+                <w:noProof/>
+                <w:webHidden/>
+              </w:rPr>
+              <w:fldChar w:fldCharType="begin"/>
+            </w:r>
+            <w:r>
+              <w:rPr>
+                <w:noProof/>
+                <w:webHidden/>
+              </w:rPr>
+              <w:instrText xml:space="preserve"> PAGEREF _Toc239006149 \h </w:instrText>
+            </w:r>
+            <w:r>
+              <w:rPr>
+                <w:noProof/>
+                <w:webHidden/>
+              </w:rPr>
+            </w:r>
+            <w:r>
+              <w:rPr>
+                <w:noProof/>
+                <w:webHidden/>
+              </w:rPr>
+              <w:fldChar w:fldCharType="separate"/>
+            </w:r>
+            <w:r>
+              <w:rPr>
+                <w:noProof/>
+                <w:webHidden/>
+              </w:rPr>
+              <w:t>5</w:t>
+            </w:r>
+            <w:r>
+              <w:rPr>
+                <w:noProof/>
+                <w:webHidden/>
+              </w:rPr>
+              <w:fldChar w:fldCharType="end"/>
+            </w:r>
+          </w:hyperlink>
+        </w:p>
+        <w:p>
+          <w:pPr>
+            <w:pStyle w:val="TDC1"/>
+            <w:rPr>
+              <w:rFonts w:asciiTheme="minorHAnsi" w:hAnsiTheme="minorHAnsi"/>
+              <w:b w:val="0"/>
+              <w:noProof/>
+              <w:color w:val="auto"/>
+              <w:kern w:val="2"/>
+              <w:sz w:val="24"/>
+              <w:szCs w:val="24"/>
+              <w:lang w:val="es-AR" w:eastAsia="es-AR"/>
+              <w14:ligatures w14:val="standardContextual"/>
+            </w:rPr>
+          </w:pPr>
+          <w:hyperlink w:anchor="_Toc239006150" w:history="1">
+            <w:r>
+              <w:rPr>
+                <w:rStyle w:val="Hipervnculo"/>
+                <w:noProof/>
+                <w:lang w:val="es-AR"/>
+              </w:rPr>
+              <w:t>Formular la hipótesis de valor</w:t>
+            </w:r>
+            <w:r>
+              <w:rPr>
+                <w:noProof/>
+                <w:webHidden/>
+              </w:rPr>
+              <w:tab/>
+            </w:r>
+            <w:r>
+              <w:rPr>
+                <w:noProof/>
+                <w:webHidden/>
+              </w:rPr>
+              <w:fldChar w:fldCharType="begin"/>
+            </w:r>
+            <w:r>
+              <w:rPr>
+                <w:noProof/>
+                <w:webHidden/>
+              </w:rPr>
+              <w:instrText xml:space="preserve"> PAGEREF _Toc239006150 \h </w:instrText>
+            </w:r>
+            <w:r>
+              <w:rPr>
+                <w:noProof/>
+                <w:webHidden/>
+              </w:rPr>
+            </w:r>
+            <w:r>
+              <w:rPr>
+                <w:noProof/>
+                <w:webHidden/>
+              </w:rPr>
+              <w:fldChar w:fldCharType="separate"/>
+            </w:r>
+            <w:r>
+              <w:rPr>
+                <w:noProof/>
+                <w:webHidden/>
+              </w:rPr>
+              <w:t>5</w:t>
             </w:r>
             <w:r>
               <w:rPr>
@@ -1480,7 +2222,7 @@
           <w:lang w:val="es-AR"/>
         </w:rPr>
       </w:pPr>
-      <w:bookmarkStart w:id="0" w:name="_Toc238779060"/>
+      <w:bookmarkStart w:id="0" w:name="_Toc239006138"/>
       <w:r>
         <w:rPr>
           <w:lang w:val="es-AR"/>
@@ -1496,7 +2238,7 @@
           <w:lang w:val="es-AR"/>
         </w:rPr>
       </w:pPr>
-      <w:bookmarkStart w:id="1" w:name="_Toc238779061"/>
+      <w:bookmarkStart w:id="1" w:name="_Toc239006139"/>
       <w:r>
         <w:rPr>
           <w:lang w:val="es-AR"/>
@@ -1527,7 +2269,7 @@
           <w:lang w:val="es-AR"/>
         </w:rPr>
       </w:pPr>
-      <w:bookmarkStart w:id="2" w:name="_Toc238779062"/>
+      <w:bookmarkStart w:id="2" w:name="_Toc239006140"/>
       <w:r>
         <w:rPr>
           <w:lang w:val="es-AR"/>
@@ -1568,8 +2310,854 @@
     </w:p>
     <w:p>
       <w:pPr>
-        <w:spacing w:after="140"/>
-        <w:jc w:val="both"/>
+        <w:pStyle w:val="Ttulo1"/>
+        <w:rPr>
+          <w:lang w:val="es-AR"/>
+        </w:rPr>
+      </w:pPr>
+      <w:bookmarkStart w:id="3" w:name="_Toc239006141"/>
+      <w:r>
+        <w:rPr>
+          <w:lang w:val="es-AR"/>
+        </w:rPr>
+        <w:t>Analizar los resultados</w:t>
+      </w:r>
+      <w:bookmarkEnd w:id="3"/>
+    </w:p>
+    <w:p>
+      <w:pPr>
+        <w:pStyle w:val="Preguntanumerada"/>
+        <w:rPr>
+          <w:lang w:val="es-AR"/>
+        </w:rPr>
+      </w:pPr>
+      <w:bookmarkStart w:id="4" w:name="_Toc239006142"/>
+      <w:r>
+        <w:rPr>
+          <w:lang w:val="es-AR"/>
+        </w:rPr>
+        <w:t>Perfil del usuario</w:t>
+      </w:r>
+      <w:bookmarkEnd w:id="4"/>
+    </w:p>
+    <w:p>
+      <w:pPr>
+        <w:rPr>
+          <w:lang w:val="es-AR"/>
+        </w:rPr>
+      </w:pPr>
+      <w:r>
+        <w:rPr>
+          <w:lang w:val="es-AR"/>
+        </w:rPr>
+        <w:t>Se analizaron las respuestas de cinco estudiantes del grupo primario, identificados como U1 a U5 según el orden de respuesta. U1, U2 y U4 concurren al campus entre una y dos veces por semana, mientras que U3 y U5 lo hacen entre tres y cuatro veces. U1 calificó la dificultad para orientarse con 7 sobre 10 y U4 con 8; U2, U3 y U5 la calificaron con 5, lo que da un promedio grupal de 6. U1 y U2 indicaron que no encontraron un aula o sector entre dos y tres veces, y U3 y U4, entre cuatro y seis veces. En esos cuatro casos, la última dificultad les hizo perder entre cinco y diez minutos: U1, U3 y U4 llegaron tarde una vez, mientras que U2 llegó tarde más de una vez. U5 no registró inconvenientes para encontrar un destino y, por ese motivo, no respondió las preguntas posteriores sobre tiempo perdido y llegadas tarde.</w:t>
+      </w:r>
+    </w:p>
+    <w:p>
+      <w:pPr>
+        <w:pStyle w:val="Preguntanumerada"/>
+        <w:rPr>
+          <w:lang w:val="es-AR"/>
+        </w:rPr>
+      </w:pPr>
+      <w:bookmarkStart w:id="5" w:name="_Toc239006143"/>
+      <w:r>
+        <w:rPr>
+          <w:lang w:val="es-AR"/>
+        </w:rPr>
+        <w:t>Necesidades reales</w:t>
+      </w:r>
+      <w:bookmarkEnd w:id="5"/>
+    </w:p>
+    <w:p>
+      <w:pPr>
+        <w:rPr>
+          <w:lang w:val="es-AR"/>
+        </w:rPr>
+      </w:pPr>
+      <w:r>
+        <w:rPr>
+          <w:lang w:val="es-AR"/>
+        </w:rPr>
+        <w:t>Los usuarios necesitan ubicar aulas y sectores con rapidez, contar con indicaciones claras durante el recorrido y conocer caminos alternativos cuando un acceso está cerrado. También requieren que la información sea fácil de consultar desde el celular y que siga siendo útil con conectividad inestable. Los recursos actuales no resuelven todo el recorrido: tres usaron el mapa institucional, pero ante una duda también recurrieron a carteles, la web, otras personas, WhatsApp o a caminar hasta encontrar el destino.</w:t>
+      </w:r>
+    </w:p>
+    <w:p>
+      <w:pPr>
+        <w:pStyle w:val="Preguntanumerada"/>
+        <w:rPr>
+          <w:lang w:val="es-AR"/>
+        </w:rPr>
+      </w:pPr>
+      <w:bookmarkStart w:id="6" w:name="_Toc239006144"/>
+      <w:r>
+        <w:rPr>
+          <w:lang w:val="es-AR"/>
+        </w:rPr>
+        <w:t>Problemas y frustraciones concretas</w:t>
+      </w:r>
+      <w:bookmarkEnd w:id="6"/>
+    </w:p>
+    <w:p>
+      <w:pPr>
+        <w:rPr>
+          <w:lang w:val="es-AR"/>
+        </w:rPr>
+      </w:pPr>
+      <w:r>
+        <w:rPr>
+          <w:lang w:val="es-AR"/>
+        </w:rPr>
+        <w:t xml:space="preserve">De los cuatro usuarios que no encontraron un lugar, dos indicaron que les ocurrió entre dos y tres veces y dos, entre cuatro y seis. En el último episodio, los cuatro perdieron entre cinco y diez minutos; tres llegaron tarde una vez y uno, más de una vez. Además, cuatro encontraron </w:t>
+      </w:r>
+      <w:r>
+        <w:rPr>
+          <w:lang w:val="es-AR"/>
+        </w:rPr>
+        <w:lastRenderedPageBreak/>
+        <w:t>pasillos, escaleras, puertas o sectores cerrados en varias oportunidades: dos pudieron desviarse sin inconvenientes, uno tardó bastante en hallar otra ruta y otro tuvo que preguntar. La orientación depende así de información dispersa y de soluciones por prueba, señalización o ayuda de terceros.</w:t>
+      </w:r>
+    </w:p>
+    <w:p>
+      <w:pPr>
+        <w:pStyle w:val="Preguntanumerada"/>
+        <w:rPr>
+          <w:lang w:val="es-AR"/>
+        </w:rPr>
+      </w:pPr>
+      <w:bookmarkStart w:id="7" w:name="_Toc239006145"/>
+      <w:r>
+        <w:rPr>
+          <w:lang w:val="es-AR"/>
+        </w:rPr>
+        <w:t>Contexto de uso</w:t>
+      </w:r>
+      <w:bookmarkEnd w:id="7"/>
+    </w:p>
+    <w:p>
+      <w:pPr>
+        <w:rPr>
+          <w:lang w:val="es-AR"/>
+        </w:rPr>
+      </w:pPr>
+      <w:r>
+        <w:rPr>
+          <w:lang w:val="es-AR"/>
+        </w:rPr>
+        <w:t>El producto se usaría dentro del campus, principalmente al buscar un destino antes de una clase, examen o trámite, a veces con poco margen de tiempo. Los cinco llevan siempre el celular, pero todos declararon datos móviles con señal irregular, por lo que la consulta debería ser rápida y tolerar conectividad limitada. También debe contemplar cambios del entorno y el clima: tres prefieren desviarse y tardar un poco más para no mojarse, mientras que dos priorizan el camino más rápido. La encuesta no determinó si normalmente circulan solos o acompañados; sí muestra que, cuando surge una dificultad, algunos consultan a compañeros, personal u otros estudiantes.</w:t>
+      </w:r>
+    </w:p>
+    <w:p>
+      <w:pPr>
+        <w:pStyle w:val="Ttulo1"/>
+        <w:rPr>
+          <w:lang w:val="es-AR"/>
+        </w:rPr>
+      </w:pPr>
+      <w:bookmarkStart w:id="8" w:name="_Toc239006146"/>
+      <w:r>
+        <w:rPr>
+          <w:lang w:val="es-AR"/>
+        </w:rPr>
+        <w:t>Confrontar los supuestos del TP1</w:t>
+      </w:r>
+      <w:bookmarkEnd w:id="8"/>
+    </w:p>
+    <w:tbl>
+      <w:tblPr>
+        <w:tblW w:w="9000" w:type="dxa"/>
+        <w:tblBorders>
+          <w:top w:val="single" w:sz="4" w:space="0" w:color="auto"/>
+          <w:left w:val="single" w:sz="4" w:space="0" w:color="auto"/>
+          <w:bottom w:val="single" w:sz="4" w:space="0" w:color="auto"/>
+          <w:right w:val="single" w:sz="4" w:space="0" w:color="auto"/>
+          <w:insideH w:val="single" w:sz="4" w:space="0" w:color="auto"/>
+          <w:insideV w:val="single" w:sz="4" w:space="0" w:color="auto"/>
+        </w:tblBorders>
+        <w:tblLayout w:type="fixed"/>
+        <w:tblCellMar>
+          <w:left w:w="70" w:type="dxa"/>
+          <w:right w:w="70" w:type="dxa"/>
+        </w:tblCellMar>
+        <w:tblLook w:val="0000" w:firstRow="0" w:lastRow="0" w:firstColumn="0" w:lastColumn="0" w:noHBand="0" w:noVBand="0"/>
+      </w:tblPr>
+      <w:tblGrid>
+        <w:gridCol w:w="3400"/>
+        <w:gridCol w:w="1400"/>
+        <w:gridCol w:w="4200"/>
+      </w:tblGrid>
+      <w:tr>
+        <w:trPr>
+          <w:cantSplit/>
+          <w:tblHeader/>
+        </w:trPr>
+        <w:tc>
+          <w:tcPr>
+            <w:tcW w:w="3400" w:type="dxa"/>
+          </w:tcPr>
+          <w:p>
+            <w:pPr>
+              <w:spacing w:after="40"/>
+              <w:rPr>
+                <w:rFonts w:cs="Arial"/>
+                <w:b/>
+                <w:sz w:val="17"/>
+                <w:lang w:val="es-AR"/>
+              </w:rPr>
+            </w:pPr>
+            <w:r>
+              <w:rPr>
+                <w:rFonts w:cs="Arial"/>
+                <w:b/>
+                <w:sz w:val="17"/>
+                <w:lang w:val="es-AR"/>
+              </w:rPr>
+              <w:t>Supuesto del TP1</w:t>
+            </w:r>
+          </w:p>
+        </w:tc>
+        <w:tc>
+          <w:tcPr>
+            <w:tcW w:w="1400" w:type="dxa"/>
+          </w:tcPr>
+          <w:p>
+            <w:pPr>
+              <w:spacing w:after="40"/>
+              <w:rPr>
+                <w:rFonts w:cs="Arial"/>
+                <w:b/>
+                <w:sz w:val="17"/>
+                <w:lang w:val="es-AR"/>
+              </w:rPr>
+            </w:pPr>
+            <w:r>
+              <w:rPr>
+                <w:rFonts w:cs="Arial"/>
+                <w:b/>
+                <w:sz w:val="17"/>
+                <w:lang w:val="es-AR"/>
+              </w:rPr>
+              <w:t>¿Se confirmó?</w:t>
+            </w:r>
+          </w:p>
+        </w:tc>
+        <w:tc>
+          <w:tcPr>
+            <w:tcW w:w="4200" w:type="dxa"/>
+          </w:tcPr>
+          <w:p>
+            <w:pPr>
+              <w:spacing w:after="40"/>
+              <w:rPr>
+                <w:rFonts w:cs="Arial"/>
+                <w:b/>
+                <w:sz w:val="17"/>
+                <w:lang w:val="es-AR"/>
+              </w:rPr>
+            </w:pPr>
+            <w:r>
+              <w:rPr>
+                <w:rFonts w:cs="Arial"/>
+                <w:b/>
+                <w:sz w:val="17"/>
+                <w:lang w:val="es-AR"/>
+              </w:rPr>
+              <w:t>Evidencia que lo sostiene o lo refuta</w:t>
+            </w:r>
+          </w:p>
+        </w:tc>
+      </w:tr>
+      <w:tr>
+        <w:trPr>
+          <w:cantSplit/>
+        </w:trPr>
+        <w:tc>
+          <w:tcPr>
+            <w:tcW w:w="3400" w:type="dxa"/>
+          </w:tcPr>
+          <w:p>
+            <w:pPr>
+              <w:spacing w:after="40"/>
+              <w:rPr>
+                <w:rFonts w:cs="Arial"/>
+                <w:sz w:val="17"/>
+                <w:lang w:val="es-AR"/>
+              </w:rPr>
+            </w:pPr>
+            <w:r>
+              <w:rPr>
+                <w:rFonts w:cs="Arial"/>
+                <w:sz w:val="17"/>
+                <w:lang w:val="es-AR"/>
+              </w:rPr>
+              <w:t>(crítico) Los ingresantes y estudiantes de primer año tienen dificultades para encontrar aulas, dependencias y servicios durante sus primeras semanas en la UNLaM.</w:t>
+            </w:r>
+          </w:p>
+        </w:tc>
+        <w:tc>
+          <w:tcPr>
+            <w:tcW w:w="1400" w:type="dxa"/>
+          </w:tcPr>
+          <w:p>
+            <w:pPr>
+              <w:spacing w:after="40"/>
+              <w:rPr>
+                <w:rFonts w:cs="Arial"/>
+                <w:sz w:val="17"/>
+                <w:lang w:val="es-AR"/>
+              </w:rPr>
+            </w:pPr>
+            <w:r>
+              <w:rPr>
+                <w:rFonts w:cs="Arial"/>
+                <w:sz w:val="17"/>
+                <w:lang w:val="es-AR"/>
+              </w:rPr>
+              <w:t>Confirmado</w:t>
+            </w:r>
+          </w:p>
+        </w:tc>
+        <w:tc>
+          <w:tcPr>
+            <w:tcW w:w="4200" w:type="dxa"/>
+          </w:tcPr>
+          <w:p>
+            <w:pPr>
+              <w:spacing w:after="40"/>
+              <w:rPr>
+                <w:rFonts w:cs="Arial"/>
+                <w:sz w:val="17"/>
+                <w:lang w:val="es-AR"/>
+              </w:rPr>
+            </w:pPr>
+            <w:r>
+              <w:rPr>
+                <w:rFonts w:cs="Arial"/>
+                <w:sz w:val="17"/>
+                <w:lang w:val="es-AR"/>
+              </w:rPr>
+              <w:t>U1 a U4 informaron que no encontraron un aula o sector entre dos y seis veces. Los cuatro perdieron entre cinco y diez minutos la última vez y llegaron tarde al menos una vez. U5 no registró episodios.</w:t>
+            </w:r>
+          </w:p>
+        </w:tc>
+      </w:tr>
+      <w:tr>
+        <w:trPr>
+          <w:cantSplit/>
+        </w:trPr>
+        <w:tc>
+          <w:tcPr>
+            <w:tcW w:w="3400" w:type="dxa"/>
+          </w:tcPr>
+          <w:p>
+            <w:pPr>
+              <w:spacing w:after="40"/>
+              <w:rPr>
+                <w:rFonts w:cs="Arial"/>
+                <w:sz w:val="17"/>
+                <w:lang w:val="es-AR"/>
+              </w:rPr>
+            </w:pPr>
+            <w:r>
+              <w:rPr>
+                <w:rFonts w:cs="Arial"/>
+                <w:sz w:val="17"/>
+                <w:lang w:val="es-AR"/>
+              </w:rPr>
+              <w:t>Una ruta dibujada resulta más útil para este grupo que consultar solamente un mapa estático del campus.</w:t>
+            </w:r>
+          </w:p>
+        </w:tc>
+        <w:tc>
+          <w:tcPr>
+            <w:tcW w:w="1400" w:type="dxa"/>
+          </w:tcPr>
+          <w:p>
+            <w:pPr>
+              <w:spacing w:after="40"/>
+              <w:rPr>
+                <w:rFonts w:cs="Arial"/>
+                <w:sz w:val="17"/>
+                <w:lang w:val="es-AR"/>
+              </w:rPr>
+            </w:pPr>
+            <w:r>
+              <w:rPr>
+                <w:rFonts w:cs="Arial"/>
+                <w:sz w:val="17"/>
+                <w:lang w:val="es-AR"/>
+              </w:rPr>
+              <w:t>Sin evidencia</w:t>
+            </w:r>
+          </w:p>
+        </w:tc>
+        <w:tc>
+          <w:tcPr>
+            <w:tcW w:w="4200" w:type="dxa"/>
+          </w:tcPr>
+          <w:p>
+            <w:pPr>
+              <w:spacing w:after="40"/>
+              <w:rPr>
+                <w:rFonts w:cs="Arial"/>
+                <w:sz w:val="17"/>
+                <w:lang w:val="es-AR"/>
+              </w:rPr>
+            </w:pPr>
+            <w:r>
+              <w:rPr>
+                <w:rFonts w:cs="Arial"/>
+                <w:sz w:val="17"/>
+                <w:lang w:val="es-AR"/>
+              </w:rPr>
+              <w:t>Tres usuarios declararon haber usado el mapa institucional y uno conocerlo sin usarlo, pero la encuesta no les presentó una ruta dibujada ni comparó ambas alternativas. Por eso no permite confirmar ni refutar la preferencia.</w:t>
+            </w:r>
+          </w:p>
+        </w:tc>
+      </w:tr>
+      <w:tr>
+        <w:trPr>
+          <w:cantSplit/>
+        </w:trPr>
+        <w:tc>
+          <w:tcPr>
+            <w:tcW w:w="3400" w:type="dxa"/>
+          </w:tcPr>
+          <w:p>
+            <w:pPr>
+              <w:spacing w:after="40"/>
+              <w:rPr>
+                <w:rFonts w:cs="Arial"/>
+                <w:sz w:val="17"/>
+                <w:lang w:val="es-AR"/>
+              </w:rPr>
+            </w:pPr>
+            <w:r>
+              <w:rPr>
+                <w:rFonts w:cs="Arial"/>
+                <w:sz w:val="17"/>
+                <w:lang w:val="es-AR"/>
+              </w:rPr>
+              <w:t>La mayoría lleva un teléfono celular con acceso a Internet mientras se desplaza por el campus.</w:t>
+            </w:r>
+          </w:p>
+        </w:tc>
+        <w:tc>
+          <w:tcPr>
+            <w:tcW w:w="1400" w:type="dxa"/>
+          </w:tcPr>
+          <w:p>
+            <w:pPr>
+              <w:spacing w:after="40"/>
+              <w:rPr>
+                <w:rFonts w:cs="Arial"/>
+                <w:sz w:val="17"/>
+                <w:lang w:val="es-AR"/>
+              </w:rPr>
+            </w:pPr>
+            <w:r>
+              <w:rPr>
+                <w:rFonts w:cs="Arial"/>
+                <w:sz w:val="17"/>
+                <w:lang w:val="es-AR"/>
+              </w:rPr>
+              <w:t>Confirmado</w:t>
+            </w:r>
+          </w:p>
+        </w:tc>
+        <w:tc>
+          <w:tcPr>
+            <w:tcW w:w="4200" w:type="dxa"/>
+          </w:tcPr>
+          <w:p>
+            <w:pPr>
+              <w:spacing w:after="40"/>
+              <w:rPr>
+                <w:rFonts w:cs="Arial"/>
+                <w:sz w:val="17"/>
+                <w:lang w:val="es-AR"/>
+              </w:rPr>
+            </w:pPr>
+            <w:r>
+              <w:rPr>
+                <w:rFonts w:cs="Arial"/>
+                <w:sz w:val="17"/>
+                <w:lang w:val="es-AR"/>
+              </w:rPr>
+              <w:t>Los cinco respondieron que llevan el celular “Siempre” y que se conectan mediante “Datos móviles con señal irregular”. Hay acceso en todos los casos, aunque no es estable.</w:t>
+            </w:r>
+          </w:p>
+        </w:tc>
+      </w:tr>
+      <w:tr>
+        <w:trPr>
+          <w:cantSplit/>
+        </w:trPr>
+        <w:tc>
+          <w:tcPr>
+            <w:tcW w:w="3400" w:type="dxa"/>
+          </w:tcPr>
+          <w:p>
+            <w:pPr>
+              <w:spacing w:after="40"/>
+              <w:rPr>
+                <w:rFonts w:cs="Arial"/>
+                <w:sz w:val="17"/>
+                <w:lang w:val="es-AR"/>
+              </w:rPr>
+            </w:pPr>
+            <w:r>
+              <w:rPr>
+                <w:rFonts w:cs="Arial"/>
+                <w:sz w:val="17"/>
+                <w:lang w:val="es-AR"/>
+              </w:rPr>
+              <w:t>Los cierres temporales de pasillos o accesos pueden volver incorrecta una ruta conocida y necesitan reflejarse en la aplicación.</w:t>
+            </w:r>
+          </w:p>
+        </w:tc>
+        <w:tc>
+          <w:tcPr>
+            <w:tcW w:w="1400" w:type="dxa"/>
+          </w:tcPr>
+          <w:p>
+            <w:pPr>
+              <w:spacing w:after="40"/>
+              <w:rPr>
+                <w:rFonts w:cs="Arial"/>
+                <w:sz w:val="17"/>
+                <w:lang w:val="es-AR"/>
+              </w:rPr>
+            </w:pPr>
+            <w:r>
+              <w:rPr>
+                <w:rFonts w:cs="Arial"/>
+                <w:sz w:val="17"/>
+                <w:lang w:val="es-AR"/>
+              </w:rPr>
+              <w:t>Confirmado</w:t>
+            </w:r>
+          </w:p>
+        </w:tc>
+        <w:tc>
+          <w:tcPr>
+            <w:tcW w:w="4200" w:type="dxa"/>
+          </w:tcPr>
+          <w:p>
+            <w:pPr>
+              <w:spacing w:after="40"/>
+              <w:rPr>
+                <w:rFonts w:cs="Arial"/>
+                <w:sz w:val="17"/>
+                <w:lang w:val="es-AR"/>
+              </w:rPr>
+            </w:pPr>
+            <w:r>
+              <w:rPr>
+                <w:rFonts w:cs="Arial"/>
+                <w:sz w:val="17"/>
+                <w:lang w:val="es-AR"/>
+              </w:rPr>
+              <w:t>Cuatro de cinco encontraron pasillos, escaleras, puertas o sectores cerrados varias veces. Dos se desviaron sin problemas, U3 tardó bastante en hallar otro camino y U5 tuvo que preguntar.</w:t>
+            </w:r>
+          </w:p>
+        </w:tc>
+      </w:tr>
+      <w:tr>
+        <w:trPr>
+          <w:cantSplit/>
+        </w:trPr>
+        <w:tc>
+          <w:tcPr>
+            <w:tcW w:w="3400" w:type="dxa"/>
+          </w:tcPr>
+          <w:p>
+            <w:pPr>
+              <w:spacing w:after="40"/>
+              <w:rPr>
+                <w:rFonts w:cs="Arial"/>
+                <w:sz w:val="17"/>
+                <w:lang w:val="es-AR"/>
+              </w:rPr>
+            </w:pPr>
+            <w:r>
+              <w:rPr>
+                <w:rFonts w:cs="Arial"/>
+                <w:sz w:val="17"/>
+                <w:lang w:val="es-AR"/>
+              </w:rPr>
+              <w:t xml:space="preserve">Cuando llueve, los usuarios prefieren una ruta </w:t>
+            </w:r>
+            <w:proofErr w:type="gramStart"/>
+            <w:r>
+              <w:rPr>
+                <w:rFonts w:cs="Arial"/>
+                <w:sz w:val="17"/>
+                <w:lang w:val="es-AR"/>
+              </w:rPr>
+              <w:t>interior</w:t>
+            </w:r>
+            <w:proofErr w:type="gramEnd"/>
+            <w:r>
+              <w:rPr>
+                <w:rFonts w:cs="Arial"/>
+                <w:sz w:val="17"/>
+                <w:lang w:val="es-AR"/>
+              </w:rPr>
+              <w:t xml:space="preserve"> aunque sea más larga que el recorrido exterior más corto.</w:t>
+            </w:r>
+          </w:p>
+        </w:tc>
+        <w:tc>
+          <w:tcPr>
+            <w:tcW w:w="1400" w:type="dxa"/>
+          </w:tcPr>
+          <w:p>
+            <w:pPr>
+              <w:spacing w:after="40"/>
+              <w:rPr>
+                <w:rFonts w:cs="Arial"/>
+                <w:sz w:val="17"/>
+                <w:lang w:val="es-AR"/>
+              </w:rPr>
+            </w:pPr>
+            <w:r>
+              <w:rPr>
+                <w:rFonts w:cs="Arial"/>
+                <w:sz w:val="17"/>
+                <w:lang w:val="es-AR"/>
+              </w:rPr>
+              <w:t>Confirmado</w:t>
+            </w:r>
+          </w:p>
+        </w:tc>
+        <w:tc>
+          <w:tcPr>
+            <w:tcW w:w="4200" w:type="dxa"/>
+          </w:tcPr>
+          <w:p>
+            <w:pPr>
+              <w:spacing w:after="40"/>
+              <w:rPr>
+                <w:rFonts w:cs="Arial"/>
+                <w:sz w:val="17"/>
+                <w:lang w:val="es-AR"/>
+              </w:rPr>
+            </w:pPr>
+            <w:r>
+              <w:rPr>
+                <w:rFonts w:cs="Arial"/>
+                <w:sz w:val="17"/>
+                <w:lang w:val="es-AR"/>
+              </w:rPr>
+              <w:t>Tres de cinco eligieron “Sí, aunque tarde un poco más”; los otros dos prefirieron el camino más rápido. La mayoría sostiene el supuesto, pero la preferencia no es uniforme y no se observó una situación de lluvia real.</w:t>
+            </w:r>
+          </w:p>
+        </w:tc>
+      </w:tr>
+    </w:tbl>
+    <w:p>
+      <w:pPr>
+        <w:rPr>
+          <w:lang w:val="es-AR"/>
+        </w:rPr>
+      </w:pPr>
+    </w:p>
+    <w:p>
+      <w:pPr>
+        <w:pStyle w:val="Preguntanumerada"/>
+        <w:rPr>
+          <w:lang w:val="es-AR"/>
+        </w:rPr>
+      </w:pPr>
+      <w:bookmarkStart w:id="9" w:name="_Toc239006147"/>
+      <w:r>
+        <w:rPr>
+          <w:lang w:val="es-AR"/>
+        </w:rPr>
+        <w:t>Hallazgos no previstos</w:t>
+      </w:r>
+      <w:bookmarkEnd w:id="9"/>
+    </w:p>
+    <w:p>
+      <w:pPr>
+        <w:rPr>
+          <w:lang w:val="es-AR"/>
+        </w:rPr>
+      </w:pPr>
+      <w:r>
+        <w:rPr>
+          <w:lang w:val="es-AR"/>
+        </w:rPr>
+        <w:t>La conectividad inestable apareció como una condición transversal: los cinco usuarios cuentan con datos móviles, pero todos describieron la señal como irregular. Esto implica que la consulta debe cargar rápido, conservar la información necesaria durante el recorrido y ofrecer una respuesta útil aun ante cortes momentáneos. También surgió que la preferencia frente a la lluvia no es única: dos usuarios priorizan llegar por el camino más rápido, por lo que conviene permitir elegir entre una ruta más breve y otra más resguardada.</w:t>
+      </w:r>
+    </w:p>
+    <w:p>
+      <w:pPr>
+        <w:pStyle w:val="Preguntanumerada"/>
+        <w:rPr>
+          <w:lang w:val="es-AR"/>
+        </w:rPr>
+      </w:pPr>
+      <w:bookmarkStart w:id="10" w:name="_Toc239006148"/>
+      <w:r>
+        <w:rPr>
+          <w:lang w:val="es-AR"/>
+        </w:rPr>
+        <w:lastRenderedPageBreak/>
+        <w:t>Supuesto crítico</w:t>
+      </w:r>
+      <w:bookmarkEnd w:id="10"/>
+    </w:p>
+    <w:p>
+      <w:pPr>
+        <w:rPr>
+          <w:lang w:val="es-AR"/>
+        </w:rPr>
+      </w:pPr>
+      <w:r>
+        <w:rPr>
+          <w:lang w:val="es-AR"/>
+        </w:rPr>
+        <w:t>El supuesto crítico quedó confirmado: cuatro de los cinco usuarios tuvieron dificultades concretas para encontrar un aula o sector, perdieron entre cinco y diez minutos y llegaron tarde al menos una vez. Esto sostiene el problema central y justifica continuar con el producto. El caso de U5 muestra que la dificultad no afecta a todos con la misma frecuencia, por lo que el diseño debe concentrarse en los momentos de desorientación y permitir una consulta inmediata, sin exigir un uso permanente.</w:t>
+      </w:r>
+    </w:p>
+    <w:p>
+      <w:pPr>
+        <w:pStyle w:val="Preguntanumerada"/>
+        <w:rPr>
+          <w:lang w:val="es-AR"/>
+        </w:rPr>
+      </w:pPr>
+      <w:bookmarkStart w:id="11" w:name="_Toc239006149"/>
+      <w:r>
+        <w:rPr>
+          <w:lang w:val="es-AR"/>
+        </w:rPr>
+        <w:t>Usuario primario</w:t>
+      </w:r>
+      <w:bookmarkEnd w:id="11"/>
+    </w:p>
+    <w:p>
+      <w:pPr>
+        <w:rPr>
+          <w:lang w:val="es-AR"/>
+        </w:rPr>
+      </w:pPr>
+      <w:r>
+        <w:rPr>
+          <w:lang w:val="es-AR"/>
+        </w:rPr>
+        <w:t>El usuario primario elegido en el TP1 sigue siendo el correcto. El relevamiento se realizó con ingresantes y estudiantes de primer año y cuatro de cinco evidenciaron el problema de orientación que origina la propuesta. Por lo tanto, se mantiene como usuario primario al Navegante, con foco en ese segmento.</w:t>
+      </w:r>
+    </w:p>
+    <w:p>
+      <w:pPr>
+        <w:pStyle w:val="Ttulo1"/>
+        <w:rPr>
+          <w:lang w:val="es-AR"/>
+        </w:rPr>
+      </w:pPr>
+      <w:bookmarkStart w:id="12" w:name="_Toc239006150"/>
+      <w:r>
+        <w:rPr>
+          <w:lang w:val="es-AR"/>
+        </w:rPr>
+        <w:t>Formular la hipótesis de valor</w:t>
+      </w:r>
+      <w:bookmarkEnd w:id="12"/>
+    </w:p>
+    <w:p>
+      <w:pPr>
+        <w:rPr>
+          <w:lang w:val="es-AR"/>
+        </w:rPr>
+      </w:pPr>
+      <w:r>
+        <w:rPr>
+          <w:b/>
+          <w:bCs/>
+          <w:lang w:val="es-AR"/>
+        </w:rPr>
+        <w:t>Creemos que</w:t>
+      </w:r>
+      <w:r>
+        <w:rPr>
+          <w:lang w:val="es-AR"/>
+        </w:rPr>
+        <w:t xml:space="preserve"> los ingresantes y estudiantes de primer año de la UNLaM </w:t>
+      </w:r>
+      <w:r>
+        <w:rPr>
+          <w:b/>
+          <w:bCs/>
+          <w:lang w:val="es-AR"/>
+        </w:rPr>
+        <w:t>tienen el problema de</w:t>
+      </w:r>
+      <w:r>
+        <w:rPr>
+          <w:lang w:val="es-AR"/>
+        </w:rPr>
+        <w:t xml:space="preserve"> no encontrar con rapidez aulas y sectores cuando todavía no conocen el campus o un recorrido habitual está cerrado, lo que puede hacerles perder entre cinco y diez minutos y llegar tarde.</w:t>
+      </w:r>
+    </w:p>
+    <w:p>
+      <w:pPr>
+        <w:rPr>
+          <w:lang w:val="es-AR"/>
+        </w:rPr>
+      </w:pPr>
+      <w:r>
+        <w:rPr>
+          <w:b/>
+          <w:bCs/>
+          <w:lang w:val="es-AR"/>
+        </w:rPr>
+        <w:t>Nuestra solución es</w:t>
+      </w:r>
+      <w:r>
+        <w:rPr>
+          <w:lang w:val="es-AR"/>
+        </w:rPr>
+        <w:t xml:space="preserve"> ¿Dónde queda?, una aplicación web para celular que muestra en el mapa una ruta clara desde un punto de partida hasta el destino, </w:t>
+      </w:r>
+      <w:r>
+        <w:rPr>
+          <w:lang w:val="es-AR"/>
+        </w:rPr>
+        <w:t xml:space="preserve">que </w:t>
+      </w:r>
+      <w:r>
+        <w:rPr>
+          <w:lang w:val="es-AR"/>
+        </w:rPr>
+        <w:t>contempla cierres y ofrece alternativas según el clima.</w:t>
+      </w:r>
+    </w:p>
+    <w:p>
+      <w:pPr>
+        <w:rPr>
+          <w:lang w:val="es-AR"/>
+        </w:rPr>
+      </w:pPr>
+      <w:r>
+        <w:rPr>
+          <w:b/>
+          <w:bCs/>
+          <w:lang w:val="es-AR"/>
+        </w:rPr>
+        <w:t>Sabremos que estamos en lo correcto cuando</w:t>
+      </w:r>
+      <w:r>
+        <w:rPr>
+          <w:lang w:val="es-AR"/>
+        </w:rPr>
+        <w:t>, en una prueba con al menos cinco usuarios del grupo primario, cuatro puedan llegar a un destino asignado en menos de cinco minutos, sin pedir indicaciones ni tomar un acceso cerrado, usando la aplicación con la conectividad disponible en el campus.</w:t>
+      </w:r>
+    </w:p>
+    <w:p>
+      <w:pPr>
         <w:rPr>
           <w:lang w:val="es-AR"/>
         </w:rPr>

</xml_diff>